<commit_message>
report: add follow-up prompt results table + grouped-bar figure (§6.1)
Full A/B/D/F/H per-cell macro-F1 matrix and a new figure (prompt_followup.png)
replacing the prose-only summary of the D/F/H recovery experiment. Added to both
report.md and the FINAL docx (media 9->10, tables 9->10; zip verified).

Co-Authored-By: Claude Fable 5 <noreply@anthropic.com>
</commit_message>
<xml_diff>
--- a/report/3_implementation_report_FINAL.docx
+++ b/report/3_implementation_report_FINAL.docx
@@ -2653,6 +2653,519 @@
       </w:r>
     </w:p>
     <w:bookmarkEnd w:id="22"/>
+    <w:tbl>
+      <w:tblPr>
+        <w:tblStyle w:val="Table"/>
+        <w:tblW w:type="auto" w:w="0"/>
+        <w:tblLook w:firstRow="1" w:lastRow="0" w:firstColumn="0" w:lastColumn="0" w:noHBand="0" w:noVBand="0" w:val="0020"/>
+      </w:tblPr>
+      <w:tblGrid>
+        <w:gridCol w:w="1131"/>
+        <w:gridCol w:w="1131"/>
+        <w:gridCol w:w="1131"/>
+        <w:gridCol w:w="1131"/>
+        <w:gridCol w:w="1131"/>
+        <w:gridCol w:w="1131"/>
+        <w:gridCol w:w="1131"/>
+      </w:tblGrid>
+      <w:tr>
+        <w:trPr>
+          <w:tblHeader w:val="on"/>
+        </w:trPr>
+        <w:tc>
+          <w:tcPr/>
+          <w:p>
+            <w:pPr>
+              <w:pStyle w:val="Compact"/>
+            </w:pPr>
+            <w:r>
+              <w:t xml:space="preserve">Model · dataset</w:t>
+            </w:r>
+          </w:p>
+        </w:tc>
+        <w:tc>
+          <w:tcPr/>
+          <w:p>
+            <w:pPr>
+              <w:pStyle w:val="Compact"/>
+            </w:pPr>
+            <w:r>
+              <w:t xml:space="preserve">A</w:t>
+            </w:r>
+          </w:p>
+        </w:tc>
+        <w:tc>
+          <w:tcPr/>
+          <w:p>
+            <w:pPr>
+              <w:pStyle w:val="Compact"/>
+            </w:pPr>
+            <w:r>
+              <w:t xml:space="preserve">B</w:t>
+            </w:r>
+          </w:p>
+        </w:tc>
+        <w:tc>
+          <w:tcPr/>
+          <w:p>
+            <w:pPr>
+              <w:pStyle w:val="Compact"/>
+            </w:pPr>
+            <w:r>
+              <w:t xml:space="preserve">D</w:t>
+            </w:r>
+          </w:p>
+        </w:tc>
+        <w:tc>
+          <w:tcPr/>
+          <w:p>
+            <w:pPr>
+              <w:pStyle w:val="Compact"/>
+            </w:pPr>
+            <w:r>
+              <w:t xml:space="preserve">F</w:t>
+            </w:r>
+          </w:p>
+        </w:tc>
+        <w:tc>
+          <w:tcPr/>
+          <w:p>
+            <w:pPr>
+              <w:pStyle w:val="Compact"/>
+            </w:pPr>
+            <w:r>
+              <w:t xml:space="preserve">H</w:t>
+            </w:r>
+          </w:p>
+        </w:tc>
+        <w:tc>
+          <w:tcPr/>
+          <w:p>
+            <w:pPr>
+              <w:pStyle w:val="Compact"/>
+            </w:pPr>
+            <w:r>
+              <w:t xml:space="preserve">Best new − best A/B</w:t>
+            </w:r>
+          </w:p>
+        </w:tc>
+      </w:tr>
+      <w:tr>
+        <w:tc>
+          <w:tcPr/>
+          <w:p>
+            <w:pPr>
+              <w:pStyle w:val="Compact"/>
+            </w:pPr>
+            <w:r>
+              <w:t xml:space="preserve">plutus-8B · FPB</w:t>
+            </w:r>
+          </w:p>
+        </w:tc>
+        <w:tc>
+          <w:tcPr/>
+          <w:p>
+            <w:pPr>
+              <w:pStyle w:val="Compact"/>
+            </w:pPr>
+            <w:r>
+              <w:t xml:space="preserve">0.662</w:t>
+            </w:r>
+          </w:p>
+        </w:tc>
+        <w:tc>
+          <w:tcPr/>
+          <w:p>
+            <w:pPr>
+              <w:pStyle w:val="Compact"/>
+            </w:pPr>
+            <w:r>
+              <w:t xml:space="preserve">0.648</w:t>
+            </w:r>
+          </w:p>
+        </w:tc>
+        <w:tc>
+          <w:tcPr/>
+          <w:p>
+            <w:pPr>
+              <w:pStyle w:val="Compact"/>
+            </w:pPr>
+            <w:r>
+              <w:t xml:space="preserve">0.614</w:t>
+            </w:r>
+          </w:p>
+        </w:tc>
+        <w:tc>
+          <w:tcPr/>
+          <w:p>
+            <w:pPr>
+              <w:pStyle w:val="Compact"/>
+            </w:pPr>
+            <w:r>
+              <w:t xml:space="preserve">0.635</w:t>
+            </w:r>
+          </w:p>
+        </w:tc>
+        <w:tc>
+          <w:tcPr/>
+          <w:p>
+            <w:pPr>
+              <w:pStyle w:val="Compact"/>
+            </w:pPr>
+            <w:r>
+              <w:rPr>
+                <w:b/>
+                <w:bCs/>
+              </w:rPr>
+              <w:t xml:space="preserve">0.753</w:t>
+            </w:r>
+          </w:p>
+        </w:tc>
+        <w:tc>
+          <w:tcPr/>
+          <w:p>
+            <w:pPr>
+              <w:pStyle w:val="Compact"/>
+            </w:pPr>
+            <w:r>
+              <w:rPr>
+                <w:b/>
+                <w:bCs/>
+              </w:rPr>
+              <w:t xml:space="preserve">+0.091 (H)</w:t>
+            </w:r>
+          </w:p>
+        </w:tc>
+      </w:tr>
+      <w:tr>
+        <w:tc>
+          <w:tcPr/>
+          <w:p>
+            <w:pPr>
+              <w:pStyle w:val="Compact"/>
+            </w:pPr>
+            <w:r>
+              <w:t xml:space="preserve">plutus-8B · FiQA</w:t>
+            </w:r>
+          </w:p>
+        </w:tc>
+        <w:tc>
+          <w:tcPr/>
+          <w:p>
+            <w:pPr>
+              <w:pStyle w:val="Compact"/>
+            </w:pPr>
+            <w:r>
+              <w:t xml:space="preserve">0.597</w:t>
+            </w:r>
+          </w:p>
+        </w:tc>
+        <w:tc>
+          <w:tcPr/>
+          <w:p>
+            <w:pPr>
+              <w:pStyle w:val="Compact"/>
+            </w:pPr>
+            <w:r>
+              <w:t xml:space="preserve">0.432</w:t>
+            </w:r>
+          </w:p>
+        </w:tc>
+        <w:tc>
+          <w:tcPr/>
+          <w:p>
+            <w:pPr>
+              <w:pStyle w:val="Compact"/>
+            </w:pPr>
+            <w:r>
+              <w:rPr>
+                <w:b/>
+                <w:bCs/>
+              </w:rPr>
+              <w:t xml:space="preserve">0.671</w:t>
+            </w:r>
+          </w:p>
+        </w:tc>
+        <w:tc>
+          <w:tcPr/>
+          <w:p>
+            <w:pPr>
+              <w:pStyle w:val="Compact"/>
+            </w:pPr>
+            <w:r>
+              <w:t xml:space="preserve">0.613</w:t>
+            </w:r>
+          </w:p>
+        </w:tc>
+        <w:tc>
+          <w:tcPr/>
+          <w:p>
+            <w:pPr>
+              <w:pStyle w:val="Compact"/>
+            </w:pPr>
+            <w:r>
+              <w:t xml:space="preserve">0.650</w:t>
+            </w:r>
+          </w:p>
+        </w:tc>
+        <w:tc>
+          <w:tcPr/>
+          <w:p>
+            <w:pPr>
+              <w:pStyle w:val="Compact"/>
+            </w:pPr>
+            <w:r>
+              <w:rPr>
+                <w:b/>
+                <w:bCs/>
+              </w:rPr>
+              <w:t xml:space="preserve">+0.074 (D)</w:t>
+            </w:r>
+          </w:p>
+        </w:tc>
+      </w:tr>
+      <w:tr>
+        <w:tc>
+          <w:tcPr/>
+          <w:p>
+            <w:pPr>
+              <w:pStyle w:val="Compact"/>
+            </w:pPr>
+            <w:r>
+              <w:t xml:space="preserve">Mistral-7B · FPB</w:t>
+            </w:r>
+          </w:p>
+        </w:tc>
+        <w:tc>
+          <w:tcPr/>
+          <w:p>
+            <w:pPr>
+              <w:pStyle w:val="Compact"/>
+            </w:pPr>
+            <w:r>
+              <w:t xml:space="preserve">0.803</w:t>
+            </w:r>
+          </w:p>
+        </w:tc>
+        <w:tc>
+          <w:tcPr/>
+          <w:p>
+            <w:pPr>
+              <w:pStyle w:val="Compact"/>
+            </w:pPr>
+            <w:r>
+              <w:t xml:space="preserve">0.689</w:t>
+            </w:r>
+          </w:p>
+        </w:tc>
+        <w:tc>
+          <w:tcPr/>
+          <w:p>
+            <w:pPr>
+              <w:pStyle w:val="Compact"/>
+            </w:pPr>
+            <w:r>
+              <w:t xml:space="preserve">0.803</w:t>
+            </w:r>
+          </w:p>
+        </w:tc>
+        <w:tc>
+          <w:tcPr/>
+          <w:p>
+            <w:pPr>
+              <w:pStyle w:val="Compact"/>
+            </w:pPr>
+            <w:r>
+              <w:rPr>
+                <w:b/>
+                <w:bCs/>
+              </w:rPr>
+              <w:t xml:space="preserve">0.841</w:t>
+            </w:r>
+          </w:p>
+        </w:tc>
+        <w:tc>
+          <w:tcPr/>
+          <w:p>
+            <w:pPr>
+              <w:pStyle w:val="Compact"/>
+            </w:pPr>
+            <w:r>
+              <w:t xml:space="preserve">0.840</w:t>
+            </w:r>
+          </w:p>
+        </w:tc>
+        <w:tc>
+          <w:tcPr/>
+          <w:p>
+            <w:pPr>
+              <w:pStyle w:val="Compact"/>
+            </w:pPr>
+            <w:r>
+              <w:rPr>
+                <w:b/>
+                <w:bCs/>
+              </w:rPr>
+              <w:t xml:space="preserve">+0.038 (F)</w:t>
+            </w:r>
+          </w:p>
+        </w:tc>
+      </w:tr>
+      <w:tr>
+        <w:tc>
+          <w:tcPr/>
+          <w:p>
+            <w:pPr>
+              <w:pStyle w:val="Compact"/>
+            </w:pPr>
+            <w:r>
+              <w:t xml:space="preserve">Mistral-7B · FiQA</w:t>
+            </w:r>
+          </w:p>
+        </w:tc>
+        <w:tc>
+          <w:tcPr/>
+          <w:p>
+            <w:pPr>
+              <w:pStyle w:val="Compact"/>
+            </w:pPr>
+            <w:r>
+              <w:t xml:space="preserve">0.599</w:t>
+            </w:r>
+          </w:p>
+        </w:tc>
+        <w:tc>
+          <w:tcPr/>
+          <w:p>
+            <w:pPr>
+              <w:pStyle w:val="Compact"/>
+            </w:pPr>
+            <w:r>
+              <w:t xml:space="preserve">0.564</w:t>
+            </w:r>
+          </w:p>
+        </w:tc>
+        <w:tc>
+          <w:tcPr/>
+          <w:p>
+            <w:pPr>
+              <w:pStyle w:val="Compact"/>
+            </w:pPr>
+            <w:r>
+              <w:t xml:space="preserve">0.648</w:t>
+            </w:r>
+          </w:p>
+        </w:tc>
+        <w:tc>
+          <w:tcPr/>
+          <w:p>
+            <w:pPr>
+              <w:pStyle w:val="Compact"/>
+            </w:pPr>
+            <w:r>
+              <w:rPr>
+                <w:b/>
+                <w:bCs/>
+              </w:rPr>
+              <w:t xml:space="preserve">0.674</w:t>
+            </w:r>
+          </w:p>
+        </w:tc>
+        <w:tc>
+          <w:tcPr/>
+          <w:p>
+            <w:pPr>
+              <w:pStyle w:val="Compact"/>
+            </w:pPr>
+            <w:r>
+              <w:t xml:space="preserve">0.621</w:t>
+            </w:r>
+          </w:p>
+        </w:tc>
+        <w:tc>
+          <w:tcPr/>
+          <w:p>
+            <w:pPr>
+              <w:pStyle w:val="Compact"/>
+            </w:pPr>
+            <w:r>
+              <w:rPr>
+                <w:b/>
+                <w:bCs/>
+              </w:rPr>
+              <w:t xml:space="preserve">+0.075 (F)</w:t>
+            </w:r>
+          </w:p>
+        </w:tc>
+      </w:tr>
+    </w:tbl>
+    <w:p>
+      <w:pPr>
+        <w:pStyle w:val="BodyText"/>
+      </w:pPr>
+      <w:r>
+        <w:rPr>
+          <w:i/>
+          <w:iCs/>
+        </w:rPr>
+        <w:t xml:space="preserve">Macro-F1, 0-shot, same 300-id subsets; new-cell coverage stayed ≥0.997 (no parse regression). No single new template wins everywhere — H rescues plutus·FPB, D rescues plutus·FiQA, F is best for both Mistral cells — which is itself the §6.3 argument for voting over prompts rather than betting on one.</w:t>
+      </w:r>
+    </w:p>
+    <w:p>
+      <w:pPr>
+        <w:pStyle w:val="CaptionedFigure"/>
+      </w:pPr>
+      <w:r>
+        <w:drawing>
+          <wp:inline>
+            <wp:extent cx="5334000" cy="2854080"/>
+            <wp:effectExtent b="0" l="0" r="0" t="0"/>
+            <wp:docPr descr="Follow-up prompt templates recover macro-F1 across all four model-dataset cells" title="" id="180" name="Picture"/>
+            <a:graphic>
+              <a:graphicData uri="http://schemas.openxmlformats.org/drawingml/2006/picture">
+                <pic:pic>
+                  <pic:nvPicPr>
+                    <pic:cNvPr descr="figures/prompt_followup.png" id="181" name="Picture"/>
+                    <pic:cNvPicPr>
+                      <a:picLocks noChangeArrowheads="1" noChangeAspect="1"/>
+                    </pic:cNvPicPr>
+                  </pic:nvPicPr>
+                  <pic:blipFill>
+                    <a:blip r:embed="rId101"/>
+                    <a:stretch>
+                      <a:fillRect/>
+                    </a:stretch>
+                  </pic:blipFill>
+                  <pic:spPr bwMode="auto">
+                    <a:xfrm>
+                      <a:off x="0" y="0"/>
+                      <a:ext cx="5334000" cy="2854080"/>
+                    </a:xfrm>
+                    <a:prstGeom prst="rect">
+                      <a:avLst/>
+                    </a:prstGeom>
+                    <a:noFill/>
+                    <a:ln w="9525">
+                      <a:noFill/>
+                      <a:headEnd/>
+                      <a:tailEnd/>
+                    </a:ln>
+                  </pic:spPr>
+                </pic:pic>
+              </a:graphicData>
+            </a:graphic>
+          </wp:inline>
+        </w:drawing>
+      </w:r>
+    </w:p>
+    <w:p>
+      <w:pPr>
+        <w:pStyle w:val="ImageCaption"/>
+      </w:pPr>
+      <w:r>
+        <w:t xml:space="preserve">Follow-up prompt templates recover macro-F1 across all four model×dataset cells.</w:t>
+      </w:r>
+    </w:p>
     <w:bookmarkStart w:id="26" w:name="few-shot-help-is-not-free"/>
     <w:p>
       <w:pPr>

</xml_diff>

<commit_message>
report: add §4.1 verbatim prompt templates (all six) to System design
New subsection reproducing templates A/B/C/D/F/H in full from src/prompts.py as
monospace blocks, so the System design section documents every prompt actually
run (not just the three one-line ensemble descriptions). Added to report.md and
the FINAL docx; six templates verified present in §4, zip intact.

Co-Authored-By: Claude Fable 5 <noreply@anthropic.com>
</commit_message>
<xml_diff>
--- a/report/3_implementation_report_FINAL.docx
+++ b/report/3_implementation_report_FINAL.docx
@@ -1419,6 +1419,390 @@
       </w:r>
       <w:r>
         <w:t xml:space="preserve"> 4-bit (not fp16); subsampled test sets for LLMs; zero-/few-shot only (no fine-tuning); a single prompt template × 0-shot for NER.</w:t>
+      </w:r>
+    </w:p>
+    <w:p>
+      <w:pPr>
+        <w:pStyle w:val="Heading3"/>
+      </w:pPr>
+      <w:r>
+        <w:t xml:space="preserve">4.1 Prompt templates (verbatim)</w:t>
+      </w:r>
+    </w:p>
+    <w:p>
+      <w:pPr>
+        <w:pStyle w:val="BodyText"/>
+      </w:pPr>
+      <w:r>
+        <w:t xml:space="preserve">All six sentiment templates ship in </w:t>
+      </w:r>
+      <w:r>
+        <w:rPr>
+          <w:rStyle w:val="VerbatimChar"/>
+        </w:rPr>
+        <w:t xml:space="preserve">src/prompts.py</w:t>
+      </w:r>
+      <w:r>
+        <w:t xml:space="preserve"> and are reproduced verbatim below. </w:t>
+      </w:r>
+      <w:r>
+        <w:rPr>
+          <w:rStyle w:val="VerbatimChar"/>
+        </w:rPr>
+        <w:t xml:space="preserve">{text}</w:t>
+      </w:r>
+      <w:r>
+        <w:t xml:space="preserve"> receives the sentence to classify; </w:t>
+      </w:r>
+      <w:r>
+        <w:rPr>
+          <w:rStyle w:val="VerbatimChar"/>
+        </w:rPr>
+        <w:t xml:space="preserve">{fewshot_block}</w:t>
+      </w:r>
+      <w:r>
+        <w:t xml:space="preserve"> is empty at 0-shot and otherwise holds the balanced examples (§5). </w:t>
+      </w:r>
+      <w:r>
+        <w:rPr>
+          <w:b/>
+          <w:bCs/>
+        </w:rPr>
+        <w:t xml:space="preserve">A / B / C</w:t>
+      </w:r>
+      <w:r>
+        <w:t xml:space="preserve"> are the three ensemble members (§6.3); </w:t>
+      </w:r>
+      <w:r>
+        <w:rPr>
+          <w:b/>
+          <w:bCs/>
+        </w:rPr>
+        <w:t xml:space="preserve">D / F / H</w:t>
+      </w:r>
+      <w:r>
+        <w:t xml:space="preserve"> are the neutral-magnet-free follow-up designs introduced in §6.1.</w:t>
+      </w:r>
+    </w:p>
+    <w:p>
+      <w:pPr>
+        <w:pStyle w:val="Compact"/>
+        <w:spacing w:before="120"/>
+      </w:pPr>
+      <w:r>
+        <w:rPr>
+          <w:b/>
+          <w:bCs/>
+        </w:rPr>
+        <w:t xml:space="preserve">Template A</w:t>
+      </w:r>
+      <w:r>
+        <w:t xml:space="preserve"> — minimal</w:t>
+      </w:r>
+    </w:p>
+    <w:p>
+      <w:pPr>
+        <w:pStyle w:val="SourceCode"/>
+      </w:pPr>
+      <w:r>
+        <w:t xml:space="preserve">Classify the sentiment of the following financial text as positive, negative, or neutral.</w:t>
+      </w:r>
+      <w:r>
+        <w:br/>
+      </w:r>
+      <w:r>
+        <w:t xml:space="preserve">{fewshot_block}</w:t>
+      </w:r>
+      <w:r>
+        <w:br/>
+      </w:r>
+      <w:r>
+        <w:t xml:space="preserve">Text: {text}</w:t>
+      </w:r>
+      <w:r>
+        <w:br/>
+      </w:r>
+      <w:r>
+        <w:t xml:space="preserve">Sentiment:</w:t>
+      </w:r>
+    </w:p>
+    <w:p>
+      <w:pPr>
+        <w:pStyle w:val="Compact"/>
+        <w:spacing w:before="120"/>
+      </w:pPr>
+      <w:r>
+        <w:rPr>
+          <w:b/>
+          <w:bCs/>
+        </w:rPr>
+        <w:t xml:space="preserve">Template B</w:t>
+      </w:r>
+      <w:r>
+        <w:t xml:space="preserve"> — analyst definition list</w:t>
+      </w:r>
+    </w:p>
+    <w:p>
+      <w:pPr>
+        <w:pStyle w:val="SourceCode"/>
+      </w:pPr>
+      <w:r>
+        <w:t xml:space="preserve">You are a financial analyst. Classify the sentiment of the text below from the perspective of an investor.</w:t>
+      </w:r>
+      <w:r>
+        <w:br/>
+      </w:r>
+      <w:r>
+        <w:t xml:space="preserve">- Positive: the text suggests favorable conditions, growth, or gains</w:t>
+      </w:r>
+      <w:r>
+        <w:br/>
+      </w:r>
+      <w:r>
+        <w:t xml:space="preserve">- Negative: the text suggests unfavorable conditions, losses, or risks</w:t>
+      </w:r>
+      <w:r>
+        <w:br/>
+      </w:r>
+      <w:r>
+        <w:t xml:space="preserve">- Neutral: the text is factual without clear positive or negative implication</w:t>
+      </w:r>
+      <w:r>
+        <w:br/>
+      </w:r>
+      <w:r>
+        <w:br/>
+      </w:r>
+      <w:r>
+        <w:t xml:space="preserve">{fewshot_block}</w:t>
+      </w:r>
+      <w:r>
+        <w:br/>
+      </w:r>
+      <w:r>
+        <w:t xml:space="preserve">Text: {text}</w:t>
+      </w:r>
+      <w:r>
+        <w:br/>
+      </w:r>
+      <w:r>
+        <w:t xml:space="preserve">Answer with one word only (positive / negative / neutral):</w:t>
+      </w:r>
+    </w:p>
+    <w:p>
+      <w:pPr>
+        <w:pStyle w:val="Compact"/>
+        <w:spacing w:before="120"/>
+      </w:pPr>
+      <w:r>
+        <w:rPr>
+          <w:b/>
+          <w:bCs/>
+        </w:rPr>
+        <w:t xml:space="preserve">Template C</w:t>
+      </w:r>
+      <w:r>
+        <w:t xml:space="preserve"> — market-reaction framing (ensemble member)</w:t>
+      </w:r>
+    </w:p>
+    <w:p>
+      <w:pPr>
+        <w:pStyle w:val="SourceCode"/>
+      </w:pPr>
+      <w:r>
+        <w:t xml:space="preserve">Read the financial statement and judge how it would move an investor's outlook.</w:t>
+      </w:r>
+      <w:r>
+        <w:br/>
+      </w:r>
+      <w:r>
+        <w:t xml:space="preserve">If it points to a better outlook it is bullish; to a worse outlook, bearish; if there is no clear directional signal, neutral.</w:t>
+      </w:r>
+      <w:r>
+        <w:br/>
+      </w:r>
+      <w:r>
+        <w:t xml:space="preserve">{fewshot_block}</w:t>
+      </w:r>
+      <w:r>
+        <w:br/>
+      </w:r>
+      <w:r>
+        <w:t xml:space="preserve">Text: {text}</w:t>
+      </w:r>
+      <w:r>
+        <w:br/>
+      </w:r>
+      <w:r>
+        <w:t xml:space="preserve">Reply with exactly one word - positive, negative, or neutral:</w:t>
+      </w:r>
+    </w:p>
+    <w:p>
+      <w:pPr>
+        <w:pStyle w:val="Compact"/>
+        <w:spacing w:before="120"/>
+      </w:pPr>
+      <w:r>
+        <w:rPr>
+          <w:b/>
+          <w:bCs/>
+        </w:rPr>
+        <w:t xml:space="preserve">Template D</w:t>
+      </w:r>
+      <w:r>
+        <w:t xml:space="preserve"> — strict structured single-token (follow-up)</w:t>
+      </w:r>
+    </w:p>
+    <w:p>
+      <w:pPr>
+        <w:pStyle w:val="SourceCode"/>
+      </w:pPr>
+      <w:r>
+        <w:t xml:space="preserve">Classify the sentiment of the financial text toward the company or asset it describes.</w:t>
+      </w:r>
+      <w:r>
+        <w:br/>
+      </w:r>
+      <w:r>
+        <w:t xml:space="preserve">Choose exactly one label from this set: [negative, neutral, positive].</w:t>
+      </w:r>
+      <w:r>
+        <w:br/>
+      </w:r>
+      <w:r>
+        <w:t xml:space="preserve">Respond with only the label as a single lowercase word. No explanation, no punctuation.</w:t>
+      </w:r>
+      <w:r>
+        <w:br/>
+      </w:r>
+      <w:r>
+        <w:t xml:space="preserve">{fewshot_block}</w:t>
+      </w:r>
+      <w:r>
+        <w:br/>
+      </w:r>
+      <w:r>
+        <w:t xml:space="preserve">Text: {text}</w:t>
+      </w:r>
+      <w:r>
+        <w:br/>
+      </w:r>
+      <w:r>
+        <w:t xml:space="preserve">Label:</w:t>
+      </w:r>
+    </w:p>
+    <w:p>
+      <w:pPr>
+        <w:pStyle w:val="Compact"/>
+        <w:spacing w:before="120"/>
+      </w:pPr>
+      <w:r>
+        <w:rPr>
+          <w:b/>
+          <w:bCs/>
+        </w:rPr>
+        <w:t xml:space="preserve">Template F</w:t>
+      </w:r>
+      <w:r>
+        <w:t xml:space="preserve"> — minimal + explicit neutral tie-break (follow-up)</w:t>
+      </w:r>
+    </w:p>
+    <w:p>
+      <w:pPr>
+        <w:pStyle w:val="SourceCode"/>
+      </w:pPr>
+      <w:r>
+        <w:t xml:space="preserve">Classify the sentiment of the financial text as positive, negative, or neutral.</w:t>
+      </w:r>
+      <w:r>
+        <w:br/>
+      </w:r>
+      <w:r>
+        <w:t xml:space="preserve">Rule: only choose neutral if the text has no positive or negative implication at all. If the text leans even slightly toward gains or losses, choose positive or negative accordingly.</w:t>
+      </w:r>
+      <w:r>
+        <w:br/>
+      </w:r>
+      <w:r>
+        <w:t xml:space="preserve">{fewshot_block}</w:t>
+      </w:r>
+      <w:r>
+        <w:br/>
+      </w:r>
+      <w:r>
+        <w:t xml:space="preserve">Text: {text}</w:t>
+      </w:r>
+      <w:r>
+        <w:br/>
+      </w:r>
+      <w:r>
+        <w:t xml:space="preserve">Sentiment:</w:t>
+      </w:r>
+    </w:p>
+    <w:p>
+      <w:pPr>
+        <w:pStyle w:val="Compact"/>
+        <w:spacing w:before="120"/>
+      </w:pPr>
+      <w:r>
+        <w:rPr>
+          <w:b/>
+          <w:bCs/>
+        </w:rPr>
+        <w:t xml:space="preserve">Template H</w:t>
+      </w:r>
+      <w:r>
+        <w:t xml:space="preserve"> — contrastive anchor, neutral demoted (follow-up)</w:t>
+      </w:r>
+    </w:p>
+    <w:p>
+      <w:pPr>
+        <w:pStyle w:val="SourceCode"/>
+      </w:pPr>
+      <w:r>
+        <w:t xml:space="preserve">Task: label the financial text's sentiment toward the company or asset.</w:t>
+      </w:r>
+      <w:r>
+        <w:br/>
+      </w:r>
+      <w:r>
+        <w:t xml:space="preserve">positive = clearly better prospects (growth, gains, gains for investors)</w:t>
+      </w:r>
+      <w:r>
+        <w:br/>
+      </w:r>
+      <w:r>
+        <w:t xml:space="preserve">negative = clearly worse prospects (losses, risk, decline)</w:t>
+      </w:r>
+      <w:r>
+        <w:br/>
+      </w:r>
+      <w:r>
+        <w:t xml:space="preserve">neutral = genuinely no directional signal (choose this only as a last resort)</w:t>
+      </w:r>
+      <w:r>
+        <w:br/>
+      </w:r>
+      <w:r>
+        <w:t xml:space="preserve">Pick the single best-fitting label. Output only that one word.</w:t>
+      </w:r>
+      <w:r>
+        <w:br/>
+      </w:r>
+      <w:r>
+        <w:t xml:space="preserve">{fewshot_block}</w:t>
+      </w:r>
+      <w:r>
+        <w:br/>
+      </w:r>
+      <w:r>
+        <w:t xml:space="preserve">Text: {text}</w:t>
+      </w:r>
+      <w:r>
+        <w:br/>
+      </w:r>
+      <w:r>
+        <w:t xml:space="preserve">Answer:</w:t>
       </w:r>
     </w:p>
     <w:bookmarkEnd w:id="14"/>

</xml_diff>